<commit_message>
Botao do joystick 2 volta o braco para a posicao de referencia
ANG_HOME passa a POS_REF (posicao de referencia), com a justificativa de
cada angulo documentada no .ino: base 90 (centro do curso), ombro 90
(braco vertical, torque minimo), cotovelo 90 (antebraco perpendicular,
longe dos 148 graus de colisao) e garra 90 (meio curso, nao aperta o
objeto nem fecha contra si mesma).

Botoes do joystick 2 invertidos: toque CURTO = volta a referencia (era
toque longo), toque LONGO = abre/fecha a garra. vaiParaHome() virou
vaiParaReferencia(), passa cada angulo por limita() e imprime a pose
alvo no serial.

Atualizados os documentos que descrevem os botoes (relatorio, manual de
montagem, guia HTML de ligacoes e rotulo do esquema eletrico) e
cad/mapa_angulos.py, que le o simbolo direto do firmware.

Co-Authored-By: Claude Opus 5 <noreply@anthropic.com>
</commit_message>
<xml_diff>
--- a/relatorio/Manual_Montagem.docx
+++ b/relatorio/Manual_Montagem.docx
@@ -9390,7 +9390,7 @@
               <w:rPr>
                 <w:sz w:val="18"/>
               </w:rPr>
-              <w:t>Vai para a posição de home (90° em todas)</w:t>
+              <w:t>Vai para a posição de referência (POS_REF: 90° em todas)</w:t>
             </w:r>
           </w:p>
         </w:tc>
@@ -9925,7 +9925,7 @@
               <w:rPr>
                 <w:sz w:val="18"/>
               </w:rPr>
-              <w:t>Abre/fecha a garra de uma vez</w:t>
+              <w:t>Volta à posição de referência (POS_REF: 90° em todas as juntas)</w:t>
             </w:r>
           </w:p>
         </w:tc>
@@ -9955,7 +9955,7 @@
               <w:rPr>
                 <w:sz w:val="18"/>
               </w:rPr>
-              <w:t>Volta para home</w:t>
+              <w:t>Abre/fecha a garra de uma vez</w:t>
             </w:r>
           </w:p>
         </w:tc>
@@ -10340,7 +10340,7 @@
         <w:pStyle w:val="ListNumber"/>
       </w:pPr>
       <w:r>
-        <w:t>Leve tudo para home com 'h'.</w:t>
+        <w:t>Leve tudo para a referência com 'h' (ou um toque curto no botão 2).</w:t>
       </w:r>
     </w:p>
     <w:p>
@@ -10555,7 +10555,7 @@
           <w:b w:val="0"/>
           <w:i w:val="0"/>
         </w:rPr>
-        <w:t>Todas as tabelas desta seção são geradas por cad/mapa_angulos.py, que lê os limites direto do firmware (ANG_MIN, ANG_MAX, ANG_HOME, GARRA_FECHADA e GARRA_ABERTA) e aplica ao modelo 3D as mesmas transformações de cad/gerar_pecas.py. Os valores de altura e alcance são medidos nas malhas, não estimados.</w:t>
+        <w:t>Todas as tabelas desta seção são geradas por cad/mapa_angulos.py, que lê os limites direto do firmware (ANG_MIN, ANG_MAX, POS_REF, GARRA_FECHADA e GARRA_ABERTA) e aplica ao modelo 3D as mesmas transformações de cad/gerar_pecas.py. Os valores de altura e alcance são medidos nas malhas, não estimados.</w:t>
       </w:r>
     </w:p>
     <w:p>
@@ -10939,7 +10939,7 @@
           <w:b w:val="0"/>
           <w:i w:val="0"/>
         </w:rPr>
-        <w:t>Faixa do firmware: 5° a 175°, home 90°. Girar a base não muda a altura nem o alcance — só a direção para onde o braço aponta. Um grau de servo é exatamente um grau de giro da plataforma.</w:t>
+        <w:t>Faixa do firmware: 5° a 175°, referência 90°. Girar a base não muda a altura nem o alcance — só a direção para onde o braço aponta. Um grau de servo é exatamente um grau de giro da plataforma.</w:t>
       </w:r>
     </w:p>
     <w:tbl>
@@ -11185,7 +11185,7 @@
               <w:rPr>
                 <w:sz w:val="18"/>
               </w:rPr>
-              <w:t>HOME</w:t>
+              <w:t>REFERÊNCIA</w:t>
             </w:r>
           </w:p>
         </w:tc>
@@ -11324,7 +11324,7 @@
           <w:b w:val="0"/>
           <w:i w:val="0"/>
         </w:rPr>
-        <w:t>Faixa do firmware: 15° a 165°, home 90°. Medidas tiradas com o cotovelo em 90°; a altura é a do ponto mais alto do conjunto e o alcance é medido do eixo da base.</w:t>
+        <w:t>Faixa do firmware: 15° a 165°, referência 90°. Medidas tiradas com o cotovelo em 90°; a altura é a do ponto mais alto do conjunto e o alcance é medido do eixo da base.</w:t>
       </w:r>
     </w:p>
     <w:tbl>
@@ -11744,7 +11744,7 @@
               <w:rPr>
                 <w:sz w:val="16"/>
               </w:rPr>
-              <w:t>HOME</w:t>
+              <w:t>REFERÊNCIA</w:t>
             </w:r>
           </w:p>
         </w:tc>
@@ -12101,7 +12101,7 @@
           <w:b w:val="0"/>
           <w:i w:val="0"/>
         </w:rPr>
-        <w:t>Faixa do firmware: 40° a 140°, home 90°. Medidas tiradas com o braço na vertical (ombro em 90°). Este é o ângulo RELATIVO entre o antebraço e o braço: 0° seria o antebraço perfeitamente alinhado com o braço.</w:t>
+        <w:t>Faixa do firmware: 40° a 140°, referência 90°. Medidas tiradas com o braço na vertical (ombro em 90°). Este é o ângulo RELATIVO entre o antebraço e o braço: 0° seria o antebraço perfeitamente alinhado com o braço.</w:t>
       </w:r>
     </w:p>
     <w:tbl>
@@ -12549,7 +12549,7 @@
               <w:rPr>
                 <w:sz w:val="16"/>
               </w:rPr>
-              <w:t>HOME</w:t>
+              <w:t>REFERÊNCIA</w:t>
             </w:r>
           </w:p>
         </w:tc>
@@ -12996,7 +12996,7 @@
               <w:rPr>
                 <w:sz w:val="17"/>
               </w:rPr>
-              <w:t>ANG_MIN de fábrica (mandíbulas se tocam em ≈72,5°)</w:t>
+              <w:t>ANG_MIN de fábrica — 1° ABAIXO do toque das mandíbulas (73°, medido por verificacao.py)</w:t>
             </w:r>
           </w:p>
         </w:tc>
@@ -13227,7 +13227,7 @@
               <w:rPr>
                 <w:sz w:val="17"/>
               </w:rPr>
-              <w:t>HOME</w:t>
+              <w:t>REFERÊNCIA</w:t>
             </w:r>
           </w:p>
         </w:tc>
@@ -13800,7 +13800,7 @@
               <w:rPr>
                 <w:sz w:val="18"/>
               </w:rPr>
-              <w:t>Home ao ligar</w:t>
+              <w:t>Referência ao ligar</w:t>
             </w:r>
           </w:p>
         </w:tc>
@@ -13815,6 +13815,64 @@
                 <w:sz w:val="18"/>
               </w:rPr>
               <w:t>Os 4 servos vão para 90° e o braço fica como a Figura 1</w:t>
+            </w:r>
+          </w:p>
+        </w:tc>
+        <w:tc>
+          <w:tcPr>
+            <w:tcW w:type="dxa" w:w="680"/>
+          </w:tcPr>
+          <w:p>
+            <w:r/>
+            <w:r>
+              <w:rPr>
+                <w:sz w:val="18"/>
+              </w:rPr>
+              <w:t>☐</w:t>
+            </w:r>
+          </w:p>
+        </w:tc>
+      </w:tr>
+      <w:tr>
+        <w:tc>
+          <w:tcPr>
+            <w:tcW w:type="dxa" w:w="454"/>
+          </w:tcPr>
+          <w:p>
+            <w:r/>
+            <w:r>
+              <w:rPr>
+                <w:sz w:val="18"/>
+              </w:rPr>
+              <w:t>1b</w:t>
+            </w:r>
+          </w:p>
+        </w:tc>
+        <w:tc>
+          <w:tcPr>
+            <w:tcW w:type="dxa" w:w="3402"/>
+          </w:tcPr>
+          <w:p>
+            <w:r/>
+            <w:r>
+              <w:rPr>
+                <w:sz w:val="18"/>
+              </w:rPr>
+              <w:t>Botão de retorno</w:t>
+            </w:r>
+          </w:p>
+        </w:tc>
+        <w:tc>
+          <w:tcPr>
+            <w:tcW w:type="dxa" w:w="4195"/>
+          </w:tcPr>
+          <w:p>
+            <w:r/>
+            <w:r>
+              <w:rPr>
+                <w:sz w:val="18"/>
+              </w:rPr>
+              <w:t>Um toque curto no botão do joystick 2, de qualquer pose, traz os 4 servos de volta à Figura 1</w:t>
             </w:r>
           </w:p>
         </w:tc>

</xml_diff>